<commit_message>
Fix data consistency: email body and attachment now use same values
- Pre-generate shared variables (trust scale, rate, duration, etc.)
  in each email loop, so body text and attachment content reference
  identical numbers instead of independent random values
- Also add GDP/CPI/PMI data to research_macro_1.pdf attachment,
  consistent with email body
- Regenerate all 100 emails and 90+ attachments with seed 42
- Update DEMO.md with actual values from new data

Co-Authored-By: Claude Sonnet 4.6 <noreply@anthropic.com>
</commit_message>
<xml_diff>
--- a/backend/data/attachments/compliance_net_capital_7.docx
+++ b/backend/data/attachments/compliance_net_capital_7.docx
@@ -19,7 +19,7 @@
     </w:p>
     <w:p>
       <w:r>
-        <w:t>报告期间：2024-05</w:t>
+        <w:t>报告期间：2024-04</w:t>
         <w:br/>
         <w:t>编制部门：风控合规部</w:t>
       </w:r>
@@ -41,7 +41,7 @@
     </w:p>
     <w:p>
       <w:r>
-        <w:t>本次检查共涉及44项检查要点，发现0项需改进事项，均为非重大问题。</w:t>
+        <w:t>本次检查共涉及25项检查要点，发现1项需改进事项，均为非重大问题。</w:t>
       </w:r>
     </w:p>
     <w:p>

</xml_diff>